<commit_message>
chore: update AI fallback settings and course deliverables
</commit_message>
<xml_diff>
--- a/docs/软件工程基础/实验1/数字图像管理软件系统需求构思及描述.docx
+++ b/docs/软件工程基础/实验1/数字图像管理软件系统需求构思及描述.docx
@@ -1,6 +1,6 @@
 
 <file path=word/document.xml><?xml version="1.0" encoding="utf-8"?>
-<w:document xmlns:wpc="http://schemas.microsoft.com/office/word/2010/wordprocessingCanvas" xmlns:cx="http://schemas.microsoft.com/office/drawing/2014/chartex" xmlns:cx1="http://schemas.microsoft.com/office/drawing/2015/9/8/chartex" xmlns:cx2="http://schemas.microsoft.com/office/drawing/2015/10/21/chartex" xmlns:cx3="http://schemas.microsoft.com/office/drawing/2016/5/9/chartex" xmlns:cx4="http://schemas.microsoft.com/office/drawing/2016/5/10/chartex" xmlns:cx5="http://schemas.microsoft.com/office/drawing/2016/5/11/chartex" xmlns:cx6="http://schemas.microsoft.com/office/drawing/2016/5/12/chartex" xmlns:cx7="http://schemas.microsoft.com/office/drawing/2016/5/13/chartex" xmlns:cx8="http://schemas.microsoft.com/office/drawing/2016/5/14/chartex" xmlns:mc="http://schemas.openxmlformats.org/markup-compatibility/2006" xmlns:aink="http://schemas.microsoft.com/office/drawing/2016/ink" xmlns:am3d="http://schemas.microsoft.com/office/drawing/2017/model3d" xmlns:o="urn:schemas-microsoft-com:office:office" xmlns:oel="http://schemas.microsoft.com/office/2019/extlst" xmlns:r="http://schemas.openxmlformats.org/officeDocument/2006/relationships" xmlns:m="http://schemas.openxmlformats.org/officeDocument/2006/math" xmlns:v="urn:schemas-microsoft-com:vml" xmlns:wp14="http://schemas.microsoft.com/office/word/2010/wordprocessingDrawing" xmlns:wp="http://schemas.openxmlformats.org/drawingml/2006/wordprocessingDrawing" xmlns:w10="urn:schemas-microsoft-com:office:word" xmlns:w="http://schemas.openxmlformats.org/wordprocessingml/2006/main" xmlns:w14="http://schemas.microsoft.com/office/word/2010/wordml" xmlns:w15="http://schemas.microsoft.com/office/word/2012/wordml" xmlns:w16cex="http://schemas.microsoft.com/office/word/2018/wordml/cex" xmlns:w16cid="http://schemas.microsoft.com/office/word/2016/wordml/cid" xmlns:w16="http://schemas.microsoft.com/office/word/2018/wordml" xmlns:w16du="http://schemas.microsoft.com/office/word/2023/wordml/word16du" xmlns:w16sdtdh="http://schemas.microsoft.com/office/word/2020/wordml/sdtdatahash" xmlns:w16se="http://schemas.microsoft.com/office/word/2015/wordml/symex" xmlns:wpg="http://schemas.microsoft.com/office/word/2010/wordprocessingGroup" xmlns:wpi="http://schemas.microsoft.com/office/word/2010/wordprocessingInk" xmlns:wne="http://schemas.microsoft.com/office/word/2006/wordml" xmlns:wps="http://schemas.microsoft.com/office/word/2010/wordprocessingShape" mc:Ignorable="w14 w15 w16se w16cid w16 w16cex w16sdtdh w16du wp14">
+<w:document xmlns:wpc="http://schemas.microsoft.com/office/word/2010/wordprocessingCanvas" xmlns:cx="http://schemas.microsoft.com/office/drawing/2014/chartex" xmlns:cx1="http://schemas.microsoft.com/office/drawing/2015/9/8/chartex" xmlns:cx2="http://schemas.microsoft.com/office/drawing/2015/10/21/chartex" xmlns:cx3="http://schemas.microsoft.com/office/drawing/2016/5/9/chartex" xmlns:cx4="http://schemas.microsoft.com/office/drawing/2016/5/10/chartex" xmlns:cx5="http://schemas.microsoft.com/office/drawing/2016/5/11/chartex" xmlns:cx6="http://schemas.microsoft.com/office/drawing/2016/5/12/chartex" xmlns:cx7="http://schemas.microsoft.com/office/drawing/2016/5/13/chartex" xmlns:cx8="http://schemas.microsoft.com/office/drawing/2016/5/14/chartex" xmlns:mc="http://schemas.openxmlformats.org/markup-compatibility/2006" xmlns:aink="http://schemas.microsoft.com/office/drawing/2016/ink" xmlns:am3d="http://schemas.microsoft.com/office/drawing/2017/model3d" xmlns:o="urn:schemas-microsoft-com:office:office" xmlns:oel="http://schemas.microsoft.com/office/2019/extlst" xmlns:r="http://schemas.openxmlformats.org/officeDocument/2006/relationships" xmlns:m="http://schemas.openxmlformats.org/officeDocument/2006/math" xmlns:v="urn:schemas-microsoft-com:vml" xmlns:wp14="http://schemas.microsoft.com/office/word/2010/wordprocessingDrawing" xmlns:wp="http://schemas.openxmlformats.org/drawingml/2006/wordprocessingDrawing" xmlns:w10="urn:schemas-microsoft-com:office:word" xmlns:w="http://schemas.openxmlformats.org/wordprocessingml/2006/main" xmlns:w14="http://schemas.microsoft.com/office/word/2010/wordml" xmlns:w15="http://schemas.microsoft.com/office/word/2012/wordml" xmlns:w16cex="http://schemas.microsoft.com/office/word/2018/wordml/cex" xmlns:w16cid="http://schemas.microsoft.com/office/word/2016/wordml/cid" xmlns:w16="http://schemas.microsoft.com/office/word/2018/wordml" xmlns:w16du="http://schemas.microsoft.com/office/word/2023/wordml/word16du" xmlns:w16sdtdh="http://schemas.microsoft.com/office/word/2020/wordml/sdtdatahash" xmlns:w16sdtfl="http://schemas.microsoft.com/office/word/2024/wordml/sdtformatlock" xmlns:w16se="http://schemas.microsoft.com/office/word/2015/wordml/symex" xmlns:wpg="http://schemas.microsoft.com/office/word/2010/wordprocessingGroup" xmlns:wpi="http://schemas.microsoft.com/office/word/2010/wordprocessingInk" xmlns:wne="http://schemas.microsoft.com/office/word/2006/wordml" xmlns:wps="http://schemas.microsoft.com/office/word/2010/wordprocessingShape" mc:Ignorable="w14 w15 w16se w16cid w16 w16cex w16sdtdh w16sdtfl w16du wp14">
   <w:background w:color="FFFFFF"/>
   <w:body>
     <w:p>
@@ -316,7 +316,25 @@
               <w:rPr>
                 <w:rFonts w:ascii="华文楷体" w:eastAsia="华文楷体" w:hAnsi="华文楷体" w:hint="eastAsia"/>
               </w:rPr>
-              <w:t>，文档审查修改</w:t>
+              <w:t>、图</w:t>
+            </w:r>
+            <w:r>
+              <w:rPr>
+                <w:rFonts w:ascii="华文楷体" w:eastAsia="华文楷体" w:hAnsi="华文楷体" w:hint="eastAsia"/>
+              </w:rPr>
+              <w:t>绘制</w:t>
+            </w:r>
+            <w:r>
+              <w:rPr>
+                <w:rFonts w:ascii="华文楷体" w:eastAsia="华文楷体" w:hAnsi="华文楷体" w:hint="eastAsia"/>
+              </w:rPr>
+              <w:t>与</w:t>
+            </w:r>
+            <w:r>
+              <w:rPr>
+                <w:rFonts w:ascii="华文楷体" w:eastAsia="华文楷体" w:hAnsi="华文楷体" w:hint="eastAsia"/>
+              </w:rPr>
+              <w:t>文档审查修改</w:t>
             </w:r>
           </w:p>
         </w:tc>
@@ -465,12 +483,14 @@
                 <w:rFonts w:ascii="华文楷体" w:eastAsia="华文楷体" w:hAnsi="华文楷体" w:hint="eastAsia"/>
               </w:rPr>
             </w:pPr>
+            <w:proofErr w:type="gramStart"/>
             <w:r>
               <w:rPr>
                 <w:rFonts w:ascii="华文楷体" w:eastAsia="华文楷体" w:hAnsi="华文楷体" w:hint="eastAsia"/>
               </w:rPr>
               <w:t>陈厚华</w:t>
             </w:r>
+            <w:proofErr w:type="gramEnd"/>
           </w:p>
         </w:tc>
         <w:tc>
@@ -570,12 +590,14 @@
                 <w:rFonts w:ascii="华文楷体" w:eastAsia="华文楷体" w:hAnsi="华文楷体" w:hint="eastAsia"/>
               </w:rPr>
             </w:pPr>
+            <w:proofErr w:type="gramStart"/>
             <w:r>
               <w:rPr>
                 <w:rFonts w:ascii="华文楷体" w:eastAsia="华文楷体" w:hAnsi="华文楷体" w:hint="eastAsia"/>
               </w:rPr>
               <w:t>陈智杰</w:t>
             </w:r>
+            <w:proofErr w:type="gramEnd"/>
           </w:p>
         </w:tc>
         <w:tc>
@@ -1159,12 +1181,14 @@
                 <w:shd w:val="pct10" w:color="auto" w:fill="FFFFFF"/>
               </w:rPr>
             </w:pPr>
+            <w:proofErr w:type="gramStart"/>
             <w:r>
               <w:rPr>
                 <w:rFonts w:hint="eastAsia"/>
               </w:rPr>
               <w:t>陈厚华</w:t>
             </w:r>
+            <w:proofErr w:type="gramEnd"/>
           </w:p>
         </w:tc>
         <w:tc>
@@ -1257,12 +1281,14 @@
                 <w:shd w:val="pct10" w:color="auto" w:fill="FFFFFF"/>
               </w:rPr>
             </w:pPr>
+            <w:proofErr w:type="gramStart"/>
             <w:r>
               <w:rPr>
                 <w:rFonts w:hint="eastAsia"/>
               </w:rPr>
               <w:t>陈厚华</w:t>
             </w:r>
+            <w:proofErr w:type="gramEnd"/>
           </w:p>
         </w:tc>
         <w:tc>
@@ -1667,12 +1693,14 @@
               <w:pStyle w:val="12"/>
               <w:jc w:val="center"/>
             </w:pPr>
+            <w:proofErr w:type="gramStart"/>
             <w:r>
               <w:rPr>
                 <w:rFonts w:hint="eastAsia"/>
               </w:rPr>
               <w:t>陈智杰</w:t>
             </w:r>
+            <w:proofErr w:type="gramEnd"/>
           </w:p>
         </w:tc>
         <w:tc>
@@ -2597,7 +2625,35 @@
         <w:rPr>
           <w:rFonts w:ascii="华文楷体" w:eastAsia="华文楷体" w:hAnsi="华文楷体" w:hint="eastAsia"/>
         </w:rPr>
-        <w:t>随着数码影像技术的普及和各类拍摄设备的深入生活，个人用户所积累的数字图像数据量呈现出爆发式增长。照片不仅承载着用户的珍贵记忆，更成为了重要的个人数字资产，因此，构建一个高效、安全且直观的本地化图像管理环境，帮助用户轻松梳理与回顾数字资产，已成为当今数字化生活的核心愿景之一。</w:t>
+        <w:t>随着数码影像技术的普及和各</w:t>
+      </w:r>
+      <w:proofErr w:type="gramStart"/>
+      <w:r>
+        <w:rPr>
+          <w:rFonts w:ascii="华文楷体" w:eastAsia="华文楷体" w:hAnsi="华文楷体" w:hint="eastAsia"/>
+        </w:rPr>
+        <w:t>类拍摄</w:t>
+      </w:r>
+      <w:proofErr w:type="gramEnd"/>
+      <w:r>
+        <w:rPr>
+          <w:rFonts w:ascii="华文楷体" w:eastAsia="华文楷体" w:hAnsi="华文楷体" w:hint="eastAsia"/>
+        </w:rPr>
+        <w:t>设备的深入生活，个人用户所积累的数字图像数据量呈现出爆发式增长。照片不仅承载着用户的珍贵记忆，更成为了重要的个人数字资产，因此，构建一个高效、安全且直观的本地化图像管理环境，帮助用户轻松梳理与回顾数字资产，已成为当今数字化生活的</w:t>
+      </w:r>
+      <w:proofErr w:type="gramStart"/>
+      <w:r>
+        <w:rPr>
+          <w:rFonts w:ascii="华文楷体" w:eastAsia="华文楷体" w:hAnsi="华文楷体" w:hint="eastAsia"/>
+        </w:rPr>
+        <w:t>核心愿景之一</w:t>
+      </w:r>
+      <w:proofErr w:type="gramEnd"/>
+      <w:r>
+        <w:rPr>
+          <w:rFonts w:ascii="华文楷体" w:eastAsia="华文楷体" w:hAnsi="华文楷体" w:hint="eastAsia"/>
+        </w:rPr>
+        <w:t>。</w:t>
       </w:r>
     </w:p>
     <w:p>
@@ -2625,7 +2681,49 @@
         <w:rPr>
           <w:rFonts w:ascii="华文楷体" w:eastAsia="华文楷体" w:hAnsi="华文楷体" w:hint="eastAsia"/>
         </w:rPr>
-        <w:t>针对上述个人图像管理场景中的挑战，本项目开发了基于PostgreSQL的数字图像集成管理系统。该系统通过目录树导航与缩略图预览的双区域联动设计，有效打破了跨文件夹浏览的障碍，实现了图片的快速定位与直观展示。依托于关系型数据库强大的事务机制，系统不仅能高效完成智能批量重命名等复杂操作，确保数据处理的原子性与安全性，还将图片元数据与操作日志统一持久化，为用户提供了一个集成化、可追溯且具备沉浸式展示体验的专业本地管理平台。</w:t>
+        <w:t>针对上述个人图像管理场景中的挑战，本项目开发了基于PostgreSQL的数字图像集成管理系统。该系统通过目录树导航与</w:t>
+      </w:r>
+      <w:proofErr w:type="gramStart"/>
+      <w:r>
+        <w:rPr>
+          <w:rFonts w:ascii="华文楷体" w:eastAsia="华文楷体" w:hAnsi="华文楷体" w:hint="eastAsia"/>
+        </w:rPr>
+        <w:t>缩略图</w:t>
+      </w:r>
+      <w:proofErr w:type="gramEnd"/>
+      <w:r>
+        <w:rPr>
+          <w:rFonts w:ascii="华文楷体" w:eastAsia="华文楷体" w:hAnsi="华文楷体" w:hint="eastAsia"/>
+        </w:rPr>
+        <w:t>预览的</w:t>
+      </w:r>
+      <w:proofErr w:type="gramStart"/>
+      <w:r>
+        <w:rPr>
+          <w:rFonts w:ascii="华文楷体" w:eastAsia="华文楷体" w:hAnsi="华文楷体" w:hint="eastAsia"/>
+        </w:rPr>
+        <w:t>双区域</w:t>
+      </w:r>
+      <w:proofErr w:type="gramEnd"/>
+      <w:r>
+        <w:rPr>
+          <w:rFonts w:ascii="华文楷体" w:eastAsia="华文楷体" w:hAnsi="华文楷体" w:hint="eastAsia"/>
+        </w:rPr>
+        <w:t>联动设计，有效打破了跨文件夹浏览的障碍，实现了图片的快速定位与直观展示。依托于关系型数据库强大的事务机制，系统不仅能高效完成智能批量重命名等复杂操作，确保数据处理的原子性与安全性，还将图片元数据与操作日志统一持久化，为用户提供了一个集成化、可追溯且具备沉浸式展示体验的</w:t>
+      </w:r>
+      <w:proofErr w:type="gramStart"/>
+      <w:r>
+        <w:rPr>
+          <w:rFonts w:ascii="华文楷体" w:eastAsia="华文楷体" w:hAnsi="华文楷体" w:hint="eastAsia"/>
+        </w:rPr>
+        <w:t>专业本地</w:t>
+      </w:r>
+      <w:proofErr w:type="gramEnd"/>
+      <w:r>
+        <w:rPr>
+          <w:rFonts w:ascii="华文楷体" w:eastAsia="华文楷体" w:hAnsi="华文楷体" w:hint="eastAsia"/>
+        </w:rPr>
+        <w:t>管理平台。</w:t>
       </w:r>
     </w:p>
     <w:p>
@@ -3002,7 +3100,51 @@
                 <w:sz w:val="18"/>
                 <w:szCs w:val="18"/>
               </w:rPr>
-              <w:t>本系统采用目录树导航与缩略图预览双区域联动设计。界面左侧以树形结构展示磁盘目录，右侧以网格形式等比展示选中目录下所有图片的缩略图，实现快速定位与直观预览。</w:t>
+              <w:t>本系统采用目录树导航与</w:t>
+            </w:r>
+            <w:proofErr w:type="gramStart"/>
+            <w:r>
+              <w:rPr>
+                <w:rFonts w:ascii="华文楷体" w:eastAsia="华文楷体" w:hAnsi="华文楷体" w:cs="宋体" w:hint="eastAsia"/>
+                <w:color w:val="000000"/>
+                <w:kern w:val="0"/>
+                <w:sz w:val="18"/>
+                <w:szCs w:val="18"/>
+              </w:rPr>
+              <w:t>缩略图预览双区域</w:t>
+            </w:r>
+            <w:proofErr w:type="gramEnd"/>
+            <w:r>
+              <w:rPr>
+                <w:rFonts w:ascii="华文楷体" w:eastAsia="华文楷体" w:hAnsi="华文楷体" w:cs="宋体" w:hint="eastAsia"/>
+                <w:color w:val="000000"/>
+                <w:kern w:val="0"/>
+                <w:sz w:val="18"/>
+                <w:szCs w:val="18"/>
+              </w:rPr>
+              <w:t>联动设计。界面左侧以树形结构展示磁盘目录，右侧以网格形式等</w:t>
+            </w:r>
+            <w:proofErr w:type="gramStart"/>
+            <w:r>
+              <w:rPr>
+                <w:rFonts w:ascii="华文楷体" w:eastAsia="华文楷体" w:hAnsi="华文楷体" w:cs="宋体" w:hint="eastAsia"/>
+                <w:color w:val="000000"/>
+                <w:kern w:val="0"/>
+                <w:sz w:val="18"/>
+                <w:szCs w:val="18"/>
+              </w:rPr>
+              <w:t>比展示</w:t>
+            </w:r>
+            <w:proofErr w:type="gramEnd"/>
+            <w:r>
+              <w:rPr>
+                <w:rFonts w:ascii="华文楷体" w:eastAsia="华文楷体" w:hAnsi="华文楷体" w:cs="宋体" w:hint="eastAsia"/>
+                <w:color w:val="000000"/>
+                <w:kern w:val="0"/>
+                <w:sz w:val="18"/>
+                <w:szCs w:val="18"/>
+              </w:rPr>
+              <w:t>选中目录下所有图片的缩略图，实现快速定位与直观预览。</w:t>
             </w:r>
           </w:p>
         </w:tc>
@@ -3571,7 +3713,29 @@
                 <w:sz w:val="18"/>
                 <w:szCs w:val="18"/>
               </w:rPr>
-              <w:t>操作系统文件管理器仅能展示文件名、大小、修改日期等基础信息，具体的元信息需要右键“属性”且难以批量修改</w:t>
+              <w:t>操作系统文件管理器仅能展示文件名、大小、修改日期等基础信息，具体的</w:t>
+            </w:r>
+            <w:proofErr w:type="gramStart"/>
+            <w:r>
+              <w:rPr>
+                <w:rFonts w:ascii="华文楷体" w:eastAsia="华文楷体" w:hAnsi="华文楷体" w:cs="宋体" w:hint="eastAsia"/>
+                <w:color w:val="000000"/>
+                <w:kern w:val="0"/>
+                <w:sz w:val="18"/>
+                <w:szCs w:val="18"/>
+              </w:rPr>
+              <w:t>元信息</w:t>
+            </w:r>
+            <w:proofErr w:type="gramEnd"/>
+            <w:r>
+              <w:rPr>
+                <w:rFonts w:ascii="华文楷体" w:eastAsia="华文楷体" w:hAnsi="华文楷体" w:cs="宋体" w:hint="eastAsia"/>
+                <w:color w:val="000000"/>
+                <w:kern w:val="0"/>
+                <w:sz w:val="18"/>
+                <w:szCs w:val="18"/>
+              </w:rPr>
+              <w:t>需要右键“属性”且难以批量修改</w:t>
             </w:r>
           </w:p>
         </w:tc>
@@ -3652,14 +3816,78 @@
           <w:rFonts w:ascii="楷体" w:eastAsia="楷体" w:hAnsi="楷体" w:cs="楷体" w:hint="eastAsia"/>
           <w:szCs w:val="21"/>
         </w:rPr>
-        <w:t>创新点一：</w:t>
+        <w:t>创新点</w:t>
+      </w:r>
+      <w:proofErr w:type="gramStart"/>
+      <w:r>
+        <w:rPr>
+          <w:rFonts w:ascii="楷体" w:eastAsia="楷体" w:hAnsi="楷体" w:cs="楷体" w:hint="eastAsia"/>
+          <w:szCs w:val="21"/>
+        </w:rPr>
+        <w:t>一</w:t>
+      </w:r>
+      <w:proofErr w:type="gramEnd"/>
+      <w:r>
+        <w:rPr>
+          <w:rFonts w:ascii="楷体" w:eastAsia="楷体" w:hAnsi="楷体" w:cs="楷体" w:hint="eastAsia"/>
+          <w:szCs w:val="21"/>
+        </w:rPr>
+        <w:t>：</w:t>
       </w:r>
       <w:r>
         <w:rPr>
           <w:rFonts w:ascii="楷体" w:eastAsia="楷体" w:hAnsi="楷体" w:cs="楷体"/>
           <w:szCs w:val="21"/>
         </w:rPr>
-        <w:t>采用目录树导航与缩略图预览双区域联动设计。界面左侧以树形结构展示计算机磁盘目录，仅显示文件夹不显示文件；右侧以网格形式等比展示选中目录下所有图片的缩略图。用户在目录树中点击任意文件夹，右侧预览区即时刷新，实现快速定位与直观预览的统一，提升大数量图片的浏览效率。</w:t>
+        <w:t>采用目录树导航与</w:t>
+      </w:r>
+      <w:proofErr w:type="gramStart"/>
+      <w:r>
+        <w:rPr>
+          <w:rFonts w:ascii="楷体" w:eastAsia="楷体" w:hAnsi="楷体" w:cs="楷体"/>
+          <w:szCs w:val="21"/>
+        </w:rPr>
+        <w:t>缩略图预览双区域</w:t>
+      </w:r>
+      <w:proofErr w:type="gramEnd"/>
+      <w:r>
+        <w:rPr>
+          <w:rFonts w:ascii="楷体" w:eastAsia="楷体" w:hAnsi="楷体" w:cs="楷体"/>
+          <w:szCs w:val="21"/>
+        </w:rPr>
+        <w:t>联动设计。界面左侧以树形结构展示计算机磁盘目录，仅</w:t>
+      </w:r>
+      <w:proofErr w:type="gramStart"/>
+      <w:r>
+        <w:rPr>
+          <w:rFonts w:ascii="楷体" w:eastAsia="楷体" w:hAnsi="楷体" w:cs="楷体"/>
+          <w:szCs w:val="21"/>
+        </w:rPr>
+        <w:t>显示文件夹不显示文件</w:t>
+      </w:r>
+      <w:proofErr w:type="gramEnd"/>
+      <w:r>
+        <w:rPr>
+          <w:rFonts w:ascii="楷体" w:eastAsia="楷体" w:hAnsi="楷体" w:cs="楷体"/>
+          <w:szCs w:val="21"/>
+        </w:rPr>
+        <w:t>；右侧以网格形式等</w:t>
+      </w:r>
+      <w:proofErr w:type="gramStart"/>
+      <w:r>
+        <w:rPr>
+          <w:rFonts w:ascii="楷体" w:eastAsia="楷体" w:hAnsi="楷体" w:cs="楷体"/>
+          <w:szCs w:val="21"/>
+        </w:rPr>
+        <w:t>比展示</w:t>
+      </w:r>
+      <w:proofErr w:type="gramEnd"/>
+      <w:r>
+        <w:rPr>
+          <w:rFonts w:ascii="楷体" w:eastAsia="楷体" w:hAnsi="楷体" w:cs="楷体"/>
+          <w:szCs w:val="21"/>
+        </w:rPr>
+        <w:t>选中目录下所有图片的缩略图。用户在目录树中点击任意文件夹，右侧预览区即时刷新，实现快速定位与直观预览的统一，提升大数量图片的浏览效率。</w:t>
       </w:r>
     </w:p>
     <w:p>
@@ -3686,7 +3914,55 @@
           <w:rFonts w:ascii="楷体" w:eastAsia="楷体" w:hAnsi="楷体" w:cs="楷体"/>
           <w:szCs w:val="21"/>
         </w:rPr>
-        <w:t>将图片元数据、缩略图数据和操作日志统一存储到PostgreSQL关系型数据库中，通过bytea数据类型存储缩略图二进制数据，通过事务机制确保批量操作（如批量重命名）的数据一致性与完整性</w:t>
+        <w:t>将图片元数据、</w:t>
+      </w:r>
+      <w:proofErr w:type="gramStart"/>
+      <w:r>
+        <w:rPr>
+          <w:rFonts w:ascii="楷体" w:eastAsia="楷体" w:hAnsi="楷体" w:cs="楷体"/>
+          <w:szCs w:val="21"/>
+        </w:rPr>
+        <w:t>缩略图数据</w:t>
+      </w:r>
+      <w:proofErr w:type="gramEnd"/>
+      <w:r>
+        <w:rPr>
+          <w:rFonts w:ascii="楷体" w:eastAsia="楷体" w:hAnsi="楷体" w:cs="楷体"/>
+          <w:szCs w:val="21"/>
+        </w:rPr>
+        <w:t>和操作日志统一存储到PostgreSQL关系型数据库中，通过</w:t>
+      </w:r>
+      <w:proofErr w:type="spellStart"/>
+      <w:r>
+        <w:rPr>
+          <w:rFonts w:ascii="楷体" w:eastAsia="楷体" w:hAnsi="楷体" w:cs="楷体"/>
+          <w:szCs w:val="21"/>
+        </w:rPr>
+        <w:t>bytea</w:t>
+      </w:r>
+      <w:proofErr w:type="spellEnd"/>
+      <w:r>
+        <w:rPr>
+          <w:rFonts w:ascii="楷体" w:eastAsia="楷体" w:hAnsi="楷体" w:cs="楷体"/>
+          <w:szCs w:val="21"/>
+        </w:rPr>
+        <w:t>数据类型存储</w:t>
+      </w:r>
+      <w:proofErr w:type="gramStart"/>
+      <w:r>
+        <w:rPr>
+          <w:rFonts w:ascii="楷体" w:eastAsia="楷体" w:hAnsi="楷体" w:cs="楷体"/>
+          <w:szCs w:val="21"/>
+        </w:rPr>
+        <w:t>缩略图</w:t>
+      </w:r>
+      <w:proofErr w:type="gramEnd"/>
+      <w:r>
+        <w:rPr>
+          <w:rFonts w:ascii="楷体" w:eastAsia="楷体" w:hAnsi="楷体" w:cs="楷体"/>
+          <w:szCs w:val="21"/>
+        </w:rPr>
+        <w:t>二进制数据，通过事务机制确保批量操作（如批量重命名）的数据一致性与完整性</w:t>
       </w:r>
       <w:r>
         <w:rPr>
@@ -3728,7 +4004,23 @@
           <w:rFonts w:ascii="楷体" w:eastAsia="楷体" w:hAnsi="楷体" w:cs="楷体"/>
           <w:szCs w:val="21"/>
         </w:rPr>
-        <w:t>即使在系统突发故障时数据也不会丢失，同时数据库提供的丰富接口便于后续进行图片检索与统计分析。</w:t>
+        <w:t>即使在系统突发故障</w:t>
+      </w:r>
+      <w:proofErr w:type="gramStart"/>
+      <w:r>
+        <w:rPr>
+          <w:rFonts w:ascii="楷体" w:eastAsia="楷体" w:hAnsi="楷体" w:cs="楷体"/>
+          <w:szCs w:val="21"/>
+        </w:rPr>
+        <w:t>时数据</w:t>
+      </w:r>
+      <w:proofErr w:type="gramEnd"/>
+      <w:r>
+        <w:rPr>
+          <w:rFonts w:ascii="楷体" w:eastAsia="楷体" w:hAnsi="楷体" w:cs="楷体"/>
+          <w:szCs w:val="21"/>
+        </w:rPr>
+        <w:t>也不会丢失，同时数据库提供的丰富接口便于后续进行图片检索与统计分析。</w:t>
       </w:r>
     </w:p>
     <w:p>
@@ -3919,7 +4211,25 @@
           <w:sz w:val="18"/>
           <w:szCs w:val="18"/>
         </w:rPr>
-        <w:t>图1 “基于PostgreSQL的数字图像集成管理系统”的UserCase模型</w:t>
+        <w:t>图1 “基于PostgreSQL的数字图像集成管理系统”的</w:t>
+      </w:r>
+      <w:proofErr w:type="spellStart"/>
+      <w:r>
+        <w:rPr>
+          <w:rFonts w:ascii="华文楷体" w:eastAsia="华文楷体" w:hAnsi="华文楷体" w:hint="eastAsia"/>
+          <w:sz w:val="18"/>
+          <w:szCs w:val="18"/>
+        </w:rPr>
+        <w:t>UserCase</w:t>
+      </w:r>
+      <w:proofErr w:type="spellEnd"/>
+      <w:r>
+        <w:rPr>
+          <w:rFonts w:ascii="华文楷体" w:eastAsia="华文楷体" w:hAnsi="华文楷体" w:hint="eastAsia"/>
+          <w:sz w:val="18"/>
+          <w:szCs w:val="18"/>
+        </w:rPr>
+        <w:t>模型</w:t>
       </w:r>
     </w:p>
     <w:p>
@@ -3938,23 +4248,25 @@
           <w:sz w:val="18"/>
           <w:szCs w:val="18"/>
         </w:rPr>
-        <w:t>绘制者：陈厚华</w:t>
-      </w:r>
+        <w:t>绘制者：</w:t>
+      </w:r>
+      <w:proofErr w:type="gramStart"/>
       <w:r>
         <w:rPr>
           <w:rFonts w:ascii="华文楷体" w:eastAsia="华文楷体" w:hAnsi="华文楷体" w:hint="eastAsia"/>
           <w:sz w:val="18"/>
           <w:szCs w:val="18"/>
         </w:rPr>
-        <w:t xml:space="preserve"> 徐阳</w:t>
-      </w:r>
+        <w:t>陈厚华</w:t>
+      </w:r>
+      <w:proofErr w:type="gramEnd"/>
       <w:r>
         <w:rPr>
           <w:rFonts w:ascii="华文楷体" w:eastAsia="华文楷体" w:hAnsi="华文楷体" w:hint="eastAsia"/>
           <w:sz w:val="18"/>
           <w:szCs w:val="18"/>
         </w:rPr>
-        <w:t xml:space="preserve"> </w:t>
+        <w:t xml:space="preserve"> 徐阳</w:t>
       </w:r>
       <w:r>
         <w:rPr>
@@ -3962,7 +4274,7 @@
           <w:sz w:val="18"/>
           <w:szCs w:val="18"/>
         </w:rPr>
-        <w:t>审查者</w:t>
+        <w:t xml:space="preserve"> </w:t>
       </w:r>
       <w:r>
         <w:rPr>
@@ -3970,7 +4282,7 @@
           <w:sz w:val="18"/>
           <w:szCs w:val="18"/>
         </w:rPr>
-        <w:t>：</w:t>
+        <w:t>审查者</w:t>
       </w:r>
       <w:r>
         <w:rPr>
@@ -3978,7 +4290,7 @@
           <w:sz w:val="18"/>
           <w:szCs w:val="18"/>
         </w:rPr>
-        <w:t>毕振岚</w:t>
+        <w:t>：</w:t>
       </w:r>
       <w:r>
         <w:rPr>
@@ -3986,6 +4298,14 @@
           <w:sz w:val="18"/>
           <w:szCs w:val="18"/>
         </w:rPr>
+        <w:t>毕振岚</w:t>
+      </w:r>
+      <w:r>
+        <w:rPr>
+          <w:rFonts w:ascii="华文楷体" w:eastAsia="华文楷体" w:hAnsi="华文楷体" w:hint="eastAsia"/>
+          <w:sz w:val="18"/>
+          <w:szCs w:val="18"/>
+        </w:rPr>
         <w:t xml:space="preserve"> 陈智杰</w:t>
       </w:r>
     </w:p>
@@ -4041,8 +4361,16 @@
         <w:rPr>
           <w:rFonts w:ascii="华文楷体" w:eastAsia="华文楷体" w:hAnsi="华文楷体"/>
         </w:rPr>
-        <w:t>用例标识：BrowseDirectory</w:t>
-      </w:r>
+        <w:t>用例标识：</w:t>
+      </w:r>
+      <w:proofErr w:type="spellStart"/>
+      <w:r>
+        <w:rPr>
+          <w:rFonts w:ascii="华文楷体" w:eastAsia="华文楷体" w:hAnsi="华文楷体"/>
+        </w:rPr>
+        <w:t>BrowseDirectory</w:t>
+      </w:r>
+      <w:proofErr w:type="spellEnd"/>
     </w:p>
     <w:p>
       <w:pPr>
@@ -4069,7 +4397,21 @@
         <w:rPr>
           <w:rFonts w:ascii="华文楷体" w:eastAsia="华文楷体" w:hAnsi="华文楷体"/>
         </w:rPr>
-        <w:t>目标：通过目录树结构浏览磁盘文件夹并定位图片目录</w:t>
+        <w:t>目标：通过目录树结构浏览</w:t>
+      </w:r>
+      <w:proofErr w:type="gramStart"/>
+      <w:r>
+        <w:rPr>
+          <w:rFonts w:ascii="华文楷体" w:eastAsia="华文楷体" w:hAnsi="华文楷体"/>
+        </w:rPr>
+        <w:t>磁盘文件夹并定位</w:t>
+      </w:r>
+      <w:proofErr w:type="gramEnd"/>
+      <w:r>
+        <w:rPr>
+          <w:rFonts w:ascii="华文楷体" w:eastAsia="华文楷体" w:hAnsi="华文楷体"/>
+        </w:rPr>
+        <w:t>图片目录</w:t>
       </w:r>
     </w:p>
     <w:p>
@@ -4181,7 +4523,21 @@
         <w:rPr>
           <w:rFonts w:ascii="华文楷体" w:eastAsia="华文楷体" w:hAnsi="华文楷体"/>
         </w:rPr>
-        <w:t>（5）系统在右侧预览区以缩略图形式展示所有图片</w:t>
+        <w:t>（5）系统在右侧预览区以</w:t>
+      </w:r>
+      <w:proofErr w:type="gramStart"/>
+      <w:r>
+        <w:rPr>
+          <w:rFonts w:ascii="华文楷体" w:eastAsia="华文楷体" w:hAnsi="华文楷体"/>
+        </w:rPr>
+        <w:t>缩略图</w:t>
+      </w:r>
+      <w:proofErr w:type="gramEnd"/>
+      <w:r>
+        <w:rPr>
+          <w:rFonts w:ascii="华文楷体" w:eastAsia="华文楷体" w:hAnsi="华文楷体"/>
+        </w:rPr>
+        <w:t>形式展示所有图片</w:t>
       </w:r>
     </w:p>
     <w:p>
@@ -4211,7 +4567,25 @@
           <w:b/>
           <w:bCs/>
         </w:rPr>
-        <w:t>（二）用例名：缩略图预览</w:t>
+        <w:t>（二）用例名：</w:t>
+      </w:r>
+      <w:proofErr w:type="gramStart"/>
+      <w:r>
+        <w:rPr>
+          <w:rFonts w:ascii="华文楷体" w:eastAsia="华文楷体" w:hAnsi="华文楷体"/>
+          <w:b/>
+          <w:bCs/>
+        </w:rPr>
+        <w:t>缩略图</w:t>
+      </w:r>
+      <w:proofErr w:type="gramEnd"/>
+      <w:r>
+        <w:rPr>
+          <w:rFonts w:ascii="华文楷体" w:eastAsia="华文楷体" w:hAnsi="华文楷体"/>
+          <w:b/>
+          <w:bCs/>
+        </w:rPr>
+        <w:t>预览</w:t>
       </w:r>
     </w:p>
     <w:p>
@@ -4225,8 +4599,16 @@
         <w:rPr>
           <w:rFonts w:ascii="华文楷体" w:eastAsia="华文楷体" w:hAnsi="华文楷体"/>
         </w:rPr>
-        <w:t>用例标识：ThumbnailPreview</w:t>
-      </w:r>
+        <w:t>用例标识：</w:t>
+      </w:r>
+      <w:proofErr w:type="spellStart"/>
+      <w:r>
+        <w:rPr>
+          <w:rFonts w:ascii="华文楷体" w:eastAsia="华文楷体" w:hAnsi="华文楷体"/>
+        </w:rPr>
+        <w:t>ThumbnailPreview</w:t>
+      </w:r>
+      <w:proofErr w:type="spellEnd"/>
     </w:p>
     <w:p>
       <w:pPr>
@@ -4254,7 +4636,21 @@
         <w:rPr>
           <w:rFonts w:ascii="华文楷体" w:eastAsia="华文楷体" w:hAnsi="华文楷体"/>
         </w:rPr>
-        <w:t>目标：以缩略图网格形式预览目录下的所有图片</w:t>
+        <w:t>目标：以</w:t>
+      </w:r>
+      <w:proofErr w:type="gramStart"/>
+      <w:r>
+        <w:rPr>
+          <w:rFonts w:ascii="华文楷体" w:eastAsia="华文楷体" w:hAnsi="华文楷体"/>
+        </w:rPr>
+        <w:t>缩略图</w:t>
+      </w:r>
+      <w:proofErr w:type="gramEnd"/>
+      <w:r>
+        <w:rPr>
+          <w:rFonts w:ascii="华文楷体" w:eastAsia="华文楷体" w:hAnsi="华文楷体"/>
+        </w:rPr>
+        <w:t>网格形式预览目录下的所有图片</w:t>
       </w:r>
     </w:p>
     <w:p>
@@ -4338,7 +4734,21 @@
         <w:rPr>
           <w:rFonts w:ascii="华文楷体" w:eastAsia="华文楷体" w:hAnsi="华文楷体"/>
         </w:rPr>
-        <w:t>（3）系统为每个图片生成缩略图（等比缩放，固定缩略图区域大小，保持原始宽高比不变形）</w:t>
+        <w:t>（3）系统为每个图片生成缩略图（等比缩放，固定</w:t>
+      </w:r>
+      <w:proofErr w:type="gramStart"/>
+      <w:r>
+        <w:rPr>
+          <w:rFonts w:ascii="华文楷体" w:eastAsia="华文楷体" w:hAnsi="华文楷体"/>
+        </w:rPr>
+        <w:t>缩略图区域</w:t>
+      </w:r>
+      <w:proofErr w:type="gramEnd"/>
+      <w:r>
+        <w:rPr>
+          <w:rFonts w:ascii="华文楷体" w:eastAsia="华文楷体" w:hAnsi="华文楷体"/>
+        </w:rPr>
+        <w:t>大小，保持原始宽高比不变形）</w:t>
       </w:r>
     </w:p>
     <w:p>
@@ -4352,7 +4762,21 @@
         <w:rPr>
           <w:rFonts w:ascii="华文楷体" w:eastAsia="华文楷体" w:hAnsi="华文楷体"/>
         </w:rPr>
-        <w:t>（4）缩略图按网格排列显示在预览区，每张图下方显示文件名</w:t>
+        <w:t>（4）</w:t>
+      </w:r>
+      <w:proofErr w:type="gramStart"/>
+      <w:r>
+        <w:rPr>
+          <w:rFonts w:ascii="华文楷体" w:eastAsia="华文楷体" w:hAnsi="华文楷体"/>
+        </w:rPr>
+        <w:t>缩略图</w:t>
+      </w:r>
+      <w:proofErr w:type="gramEnd"/>
+      <w:r>
+        <w:rPr>
+          <w:rFonts w:ascii="华文楷体" w:eastAsia="华文楷体" w:hAnsi="华文楷体"/>
+        </w:rPr>
+        <w:t>按网格排列显示在预览区，每张图下方显示文件名</w:t>
       </w:r>
     </w:p>
     <w:p>
@@ -4396,8 +4820,16 @@
         <w:rPr>
           <w:rFonts w:ascii="华文楷体" w:eastAsia="华文楷体" w:hAnsi="华文楷体"/>
         </w:rPr>
-        <w:t>用例标识：SelectImage</w:t>
-      </w:r>
+        <w:t>用例标识：</w:t>
+      </w:r>
+      <w:proofErr w:type="spellStart"/>
+      <w:r>
+        <w:rPr>
+          <w:rFonts w:ascii="华文楷体" w:eastAsia="华文楷体" w:hAnsi="华文楷体"/>
+        </w:rPr>
+        <w:t>SelectImage</w:t>
+      </w:r>
+      <w:proofErr w:type="spellEnd"/>
     </w:p>
     <w:p>
       <w:pPr>
@@ -4494,7 +4926,21 @@
         <w:rPr>
           <w:rFonts w:ascii="华文楷体" w:eastAsia="华文楷体" w:hAnsi="华文楷体"/>
         </w:rPr>
-        <w:t>：用户左键点击某张缩略图，该图被选中，之前选中的图失去选中状态</w:t>
+        <w:t>：用户左键点击某张缩略图，该图被选中，之前选中的</w:t>
+      </w:r>
+      <w:proofErr w:type="gramStart"/>
+      <w:r>
+        <w:rPr>
+          <w:rFonts w:ascii="华文楷体" w:eastAsia="华文楷体" w:hAnsi="华文楷体"/>
+        </w:rPr>
+        <w:t>图失去</w:t>
+      </w:r>
+      <w:proofErr w:type="gramEnd"/>
+      <w:r>
+        <w:rPr>
+          <w:rFonts w:ascii="华文楷体" w:eastAsia="华文楷体" w:hAnsi="华文楷体"/>
+        </w:rPr>
+        <w:t>选中状态</w:t>
       </w:r>
     </w:p>
     <w:p>
@@ -4550,7 +4996,21 @@
         <w:rPr>
           <w:rFonts w:ascii="华文楷体" w:eastAsia="华文楷体" w:hAnsi="华文楷体"/>
         </w:rPr>
-        <w:t>：用户在预览区按住左键拖拽，形成矩形选择框，框内的所有缩略图被选中</w:t>
+        <w:t>：用户在预览区按住左键拖拽，形成矩形选择框，框内的所有</w:t>
+      </w:r>
+      <w:proofErr w:type="gramStart"/>
+      <w:r>
+        <w:rPr>
+          <w:rFonts w:ascii="华文楷体" w:eastAsia="华文楷体" w:hAnsi="华文楷体"/>
+        </w:rPr>
+        <w:t>缩略图</w:t>
+      </w:r>
+      <w:proofErr w:type="gramEnd"/>
+      <w:r>
+        <w:rPr>
+          <w:rFonts w:ascii="华文楷体" w:eastAsia="华文楷体" w:hAnsi="华文楷体"/>
+        </w:rPr>
+        <w:t>被选中</w:t>
       </w:r>
     </w:p>
     <w:p>
@@ -4622,8 +5082,16 @@
         <w:rPr>
           <w:rFonts w:ascii="华文楷体" w:eastAsia="华文楷体" w:hAnsi="华文楷体"/>
         </w:rPr>
-        <w:t>用例标识：DeleteImage</w:t>
-      </w:r>
+        <w:t>用例标识：</w:t>
+      </w:r>
+      <w:proofErr w:type="spellStart"/>
+      <w:r>
+        <w:rPr>
+          <w:rFonts w:ascii="华文楷体" w:eastAsia="华文楷体" w:hAnsi="华文楷体"/>
+        </w:rPr>
+        <w:t>DeleteImage</w:t>
+      </w:r>
+      <w:proofErr w:type="spellEnd"/>
     </w:p>
     <w:p>
       <w:pPr>
@@ -4806,8 +5274,16 @@
         <w:rPr>
           <w:rFonts w:ascii="华文楷体" w:eastAsia="华文楷体" w:hAnsi="华文楷体"/>
         </w:rPr>
-        <w:t>用例标识：CopyPasteImage</w:t>
-      </w:r>
+        <w:t>用例标识：</w:t>
+      </w:r>
+      <w:proofErr w:type="spellStart"/>
+      <w:r>
+        <w:rPr>
+          <w:rFonts w:ascii="华文楷体" w:eastAsia="华文楷体" w:hAnsi="华文楷体"/>
+        </w:rPr>
+        <w:t>CopyPasteImage</w:t>
+      </w:r>
+      <w:proofErr w:type="spellEnd"/>
     </w:p>
     <w:p>
       <w:pPr>
@@ -4919,7 +5395,21 @@
         <w:rPr>
           <w:rFonts w:ascii="华文楷体" w:eastAsia="华文楷体" w:hAnsi="华文楷体"/>
         </w:rPr>
-        <w:t>（3）用户执行“粘贴”操作（右键菜单或快捷键Ctrl+V）</w:t>
+        <w:t>（3）用户执行“粘贴”操作（右键菜单或快捷键</w:t>
+      </w:r>
+      <w:proofErr w:type="spellStart"/>
+      <w:r>
+        <w:rPr>
+          <w:rFonts w:ascii="华文楷体" w:eastAsia="华文楷体" w:hAnsi="华文楷体"/>
+        </w:rPr>
+        <w:t>Ctrl+V</w:t>
+      </w:r>
+      <w:proofErr w:type="spellEnd"/>
+      <w:r>
+        <w:rPr>
+          <w:rFonts w:ascii="华文楷体" w:eastAsia="华文楷体" w:hAnsi="华文楷体"/>
+        </w:rPr>
+        <w:t>）</w:t>
       </w:r>
     </w:p>
     <w:p>
@@ -4961,7 +5451,21 @@
         <w:rPr>
           <w:rFonts w:ascii="华文楷体" w:eastAsia="华文楷体" w:hAnsi="华文楷体"/>
         </w:rPr>
-        <w:t>（6）数据库记录新图片信息和复制操作日志</w:t>
+        <w:t>（6）数据库记录</w:t>
+      </w:r>
+      <w:proofErr w:type="gramStart"/>
+      <w:r>
+        <w:rPr>
+          <w:rFonts w:ascii="华文楷体" w:eastAsia="华文楷体" w:hAnsi="华文楷体"/>
+        </w:rPr>
+        <w:t>新图片</w:t>
+      </w:r>
+      <w:proofErr w:type="gramEnd"/>
+      <w:r>
+        <w:rPr>
+          <w:rFonts w:ascii="华文楷体" w:eastAsia="华文楷体" w:hAnsi="华文楷体"/>
+        </w:rPr>
+        <w:t>信息和复制操作日志</w:t>
       </w:r>
     </w:p>
     <w:p>
@@ -5005,8 +5509,16 @@
         <w:rPr>
           <w:rFonts w:ascii="华文楷体" w:eastAsia="华文楷体" w:hAnsi="华文楷体"/>
         </w:rPr>
-        <w:t>用例标识：RenameImage</w:t>
-      </w:r>
+        <w:t>用例标识：</w:t>
+      </w:r>
+      <w:proofErr w:type="spellStart"/>
+      <w:r>
+        <w:rPr>
+          <w:rFonts w:ascii="华文楷体" w:eastAsia="华文楷体" w:hAnsi="华文楷体"/>
+        </w:rPr>
+        <w:t>RenameImage</w:t>
+      </w:r>
+      <w:proofErr w:type="spellEnd"/>
     </w:p>
     <w:p>
       <w:pPr>
@@ -5313,8 +5825,16 @@
         <w:rPr>
           <w:rFonts w:ascii="华文楷体" w:eastAsia="华文楷体" w:hAnsi="华文楷体"/>
         </w:rPr>
-        <w:t>用例标识：ContextMenu</w:t>
-      </w:r>
+        <w:t>用例标识：</w:t>
+      </w:r>
+      <w:proofErr w:type="spellStart"/>
+      <w:r>
+        <w:rPr>
+          <w:rFonts w:ascii="华文楷体" w:eastAsia="华文楷体" w:hAnsi="华文楷体"/>
+        </w:rPr>
+        <w:t>ContextMenu</w:t>
+      </w:r>
+      <w:proofErr w:type="spellEnd"/>
     </w:p>
     <w:p>
       <w:pPr>
@@ -5668,8 +6188,16 @@
         <w:rPr>
           <w:rFonts w:ascii="华文楷体" w:eastAsia="华文楷体" w:hAnsi="华文楷体"/>
         </w:rPr>
-        <w:t>用例标识：StatusDisplay</w:t>
-      </w:r>
+        <w:t>用例标识：</w:t>
+      </w:r>
+      <w:proofErr w:type="spellStart"/>
+      <w:r>
+        <w:rPr>
+          <w:rFonts w:ascii="华文楷体" w:eastAsia="华文楷体" w:hAnsi="华文楷体"/>
+        </w:rPr>
+        <w:t>StatusDisplay</w:t>
+      </w:r>
+      <w:proofErr w:type="spellEnd"/>
     </w:p>
     <w:p>
       <w:pPr>
@@ -6129,8 +6657,16 @@
               <w:rPr>
                 <w:rFonts w:ascii="Times New Roman" w:hAnsi="Times New Roman" w:cs="Times New Roman"/>
               </w:rPr>
-              <w:t>UC-BrowseDirectory</w:t>
-            </w:r>
+              <w:t>UC-</w:t>
+            </w:r>
+            <w:proofErr w:type="spellStart"/>
+            <w:r>
+              <w:rPr>
+                <w:rFonts w:ascii="Times New Roman" w:hAnsi="Times New Roman" w:cs="Times New Roman"/>
+              </w:rPr>
+              <w:t>BrowseDirectory</w:t>
+            </w:r>
+            <w:proofErr w:type="spellEnd"/>
           </w:p>
         </w:tc>
         <w:tc>
@@ -6252,6 +6788,7 @@
                 <w:szCs w:val="18"/>
               </w:rPr>
             </w:pPr>
+            <w:proofErr w:type="gramStart"/>
             <w:r>
               <w:rPr>
                 <w:rFonts w:ascii="华文楷体" w:eastAsia="华文楷体" w:hAnsi="华文楷体" w:cs="Segoe UI"/>
@@ -6259,7 +6796,17 @@
                 <w:sz w:val="18"/>
                 <w:szCs w:val="18"/>
               </w:rPr>
-              <w:t>缩略图预览</w:t>
+              <w:t>缩略图</w:t>
+            </w:r>
+            <w:proofErr w:type="gramEnd"/>
+            <w:r>
+              <w:rPr>
+                <w:rFonts w:ascii="华文楷体" w:eastAsia="华文楷体" w:hAnsi="华文楷体" w:cs="Segoe UI"/>
+                <w:color w:val="0F1115"/>
+                <w:sz w:val="18"/>
+                <w:szCs w:val="18"/>
+              </w:rPr>
+              <w:t>预览</w:t>
             </w:r>
           </w:p>
         </w:tc>
@@ -6280,8 +6827,16 @@
               <w:rPr>
                 <w:rFonts w:ascii="Times New Roman" w:hAnsi="Times New Roman" w:cs="Times New Roman"/>
               </w:rPr>
-              <w:t>UC-ThumbnailPreview</w:t>
-            </w:r>
+              <w:t>UC-</w:t>
+            </w:r>
+            <w:proofErr w:type="spellStart"/>
+            <w:r>
+              <w:rPr>
+                <w:rFonts w:ascii="Times New Roman" w:hAnsi="Times New Roman" w:cs="Times New Roman"/>
+              </w:rPr>
+              <w:t>ThumbnailPreview</w:t>
+            </w:r>
+            <w:proofErr w:type="spellEnd"/>
           </w:p>
         </w:tc>
         <w:tc>
@@ -6422,8 +6977,16 @@
               <w:rPr>
                 <w:rFonts w:ascii="Times New Roman" w:hAnsi="Times New Roman" w:cs="Times New Roman"/>
               </w:rPr>
-              <w:t>UC-SelectImage</w:t>
-            </w:r>
+              <w:t>UC-</w:t>
+            </w:r>
+            <w:proofErr w:type="spellStart"/>
+            <w:r>
+              <w:rPr>
+                <w:rFonts w:ascii="Times New Roman" w:hAnsi="Times New Roman" w:cs="Times New Roman"/>
+              </w:rPr>
+              <w:t>SelectImage</w:t>
+            </w:r>
+            <w:proofErr w:type="spellEnd"/>
           </w:p>
         </w:tc>
         <w:tc>
@@ -6568,8 +7131,16 @@
               <w:rPr>
                 <w:rFonts w:ascii="Times New Roman" w:hAnsi="Times New Roman" w:cs="Times New Roman"/>
               </w:rPr>
-              <w:t>UC-StatusDisplay</w:t>
-            </w:r>
+              <w:t>UC-</w:t>
+            </w:r>
+            <w:proofErr w:type="spellStart"/>
+            <w:r>
+              <w:rPr>
+                <w:rFonts w:ascii="Times New Roman" w:hAnsi="Times New Roman" w:cs="Times New Roman"/>
+              </w:rPr>
+              <w:t>StatusDisplay</w:t>
+            </w:r>
+            <w:proofErr w:type="spellEnd"/>
           </w:p>
         </w:tc>
         <w:tc>
@@ -6715,8 +7286,16 @@
               <w:rPr>
                 <w:rFonts w:ascii="Times New Roman" w:hAnsi="Times New Roman" w:cs="Times New Roman"/>
               </w:rPr>
-              <w:t>UC-DatabasePersistence</w:t>
-            </w:r>
+              <w:t>UC-</w:t>
+            </w:r>
+            <w:proofErr w:type="spellStart"/>
+            <w:r>
+              <w:rPr>
+                <w:rFonts w:ascii="Times New Roman" w:hAnsi="Times New Roman" w:cs="Times New Roman"/>
+              </w:rPr>
+              <w:t>DatabasePersistence</w:t>
+            </w:r>
+            <w:proofErr w:type="spellEnd"/>
           </w:p>
         </w:tc>
         <w:tc>
@@ -6859,8 +7438,16 @@
               <w:rPr>
                 <w:rFonts w:ascii="Times New Roman" w:hAnsi="Times New Roman" w:cs="Times New Roman"/>
               </w:rPr>
-              <w:t>UC-DeleteImage</w:t>
-            </w:r>
+              <w:t>UC-</w:t>
+            </w:r>
+            <w:proofErr w:type="spellStart"/>
+            <w:r>
+              <w:rPr>
+                <w:rFonts w:ascii="Times New Roman" w:hAnsi="Times New Roman" w:cs="Times New Roman"/>
+              </w:rPr>
+              <w:t>DeleteImage</w:t>
+            </w:r>
+            <w:proofErr w:type="spellEnd"/>
           </w:p>
         </w:tc>
         <w:tc>
@@ -7012,8 +7599,16 @@
               <w:rPr>
                 <w:rFonts w:ascii="Times New Roman" w:hAnsi="Times New Roman" w:cs="Times New Roman"/>
               </w:rPr>
-              <w:t>UC-CopyPasteImage</w:t>
-            </w:r>
+              <w:t>UC-</w:t>
+            </w:r>
+            <w:proofErr w:type="spellStart"/>
+            <w:r>
+              <w:rPr>
+                <w:rFonts w:ascii="Times New Roman" w:hAnsi="Times New Roman" w:cs="Times New Roman"/>
+              </w:rPr>
+              <w:t>CopyPasteImage</w:t>
+            </w:r>
+            <w:proofErr w:type="spellEnd"/>
           </w:p>
         </w:tc>
         <w:tc>
@@ -7156,8 +7751,16 @@
               <w:rPr>
                 <w:rFonts w:ascii="Times New Roman" w:hAnsi="Times New Roman" w:cs="Times New Roman"/>
               </w:rPr>
-              <w:t>UC-RenameImage</w:t>
-            </w:r>
+              <w:t>UC-</w:t>
+            </w:r>
+            <w:proofErr w:type="spellStart"/>
+            <w:r>
+              <w:rPr>
+                <w:rFonts w:ascii="Times New Roman" w:hAnsi="Times New Roman" w:cs="Times New Roman"/>
+              </w:rPr>
+              <w:t>RenameImage</w:t>
+            </w:r>
+            <w:proofErr w:type="spellEnd"/>
           </w:p>
         </w:tc>
         <w:tc>
@@ -7327,8 +7930,16 @@
               <w:rPr>
                 <w:rFonts w:ascii="Times New Roman" w:hAnsi="Times New Roman" w:cs="Times New Roman"/>
               </w:rPr>
-              <w:t>UC-ContextMenu</w:t>
-            </w:r>
+              <w:t>UC-</w:t>
+            </w:r>
+            <w:proofErr w:type="spellStart"/>
+            <w:r>
+              <w:rPr>
+                <w:rFonts w:ascii="Times New Roman" w:hAnsi="Times New Roman" w:cs="Times New Roman"/>
+              </w:rPr>
+              <w:t>ContextMenu</w:t>
+            </w:r>
+            <w:proofErr w:type="spellEnd"/>
           </w:p>
         </w:tc>
         <w:tc>
@@ -7577,7 +8188,35 @@
         <w:rPr>
           <w:rFonts w:ascii="华文楷体" w:eastAsia="华文楷体" w:hAnsi="华文楷体"/>
         </w:rPr>
-        <w:t>本软件的可行性相对较高。拥有大量数字照片的个人用户在图片浏览与管理方面存在明确的信息化需求，目录树导航、缩略图预览、批量重命名等功能的集成能够有效提升管理效率，具有广阔的应用空间。系统采用PostgreSQL关系型数据库存储图片元数据、缩略图数据与操作日志，通过事务机制保障了数据的一致性与安全性，同时也为后续功能扩展和与其</w:t>
+        <w:t>本软件的可行性相对较高。拥有大量数字照片的个人用户在图片浏览与管理方面存在明确的信息化需求，目录树导航、</w:t>
+      </w:r>
+      <w:proofErr w:type="gramStart"/>
+      <w:r>
+        <w:rPr>
+          <w:rFonts w:ascii="华文楷体" w:eastAsia="华文楷体" w:hAnsi="华文楷体"/>
+        </w:rPr>
+        <w:t>缩略图</w:t>
+      </w:r>
+      <w:proofErr w:type="gramEnd"/>
+      <w:r>
+        <w:rPr>
+          <w:rFonts w:ascii="华文楷体" w:eastAsia="华文楷体" w:hAnsi="华文楷体"/>
+        </w:rPr>
+        <w:t>预览、批量重命名等功能的集成能够有效提升管理效率，具有广阔的应用空间。系统采用PostgreSQL关系型数据库存储图片元数据、</w:t>
+      </w:r>
+      <w:proofErr w:type="gramStart"/>
+      <w:r>
+        <w:rPr>
+          <w:rFonts w:ascii="华文楷体" w:eastAsia="华文楷体" w:hAnsi="华文楷体"/>
+        </w:rPr>
+        <w:t>缩略图数据</w:t>
+      </w:r>
+      <w:proofErr w:type="gramEnd"/>
+      <w:r>
+        <w:rPr>
+          <w:rFonts w:ascii="华文楷体" w:eastAsia="华文楷体" w:hAnsi="华文楷体"/>
+        </w:rPr>
+        <w:t>与操作日志，通过事务机制保障了数据的一致性与安全性，同时也为后续功能扩展和与其</w:t>
       </w:r>
       <w:r>
         <w:rPr>
@@ -7617,7 +8256,21 @@
         <w:rPr>
           <w:rFonts w:ascii="华文楷体" w:eastAsia="华文楷体" w:hAnsi="华文楷体" w:hint="eastAsia"/>
         </w:rPr>
-        <w:t>，比如使用环境变量，或者对配置文件中的关键信息进行加密，或者只在第一次创建数据库的时候在CLI显式提供密码，并随后提示用户修改</w:t>
+        <w:t>，比如使用环境变量，或者对配置文件中的关键信息进行加密，或者只在第一次创建数据库的时候在CLI显</w:t>
+      </w:r>
+      <w:proofErr w:type="gramStart"/>
+      <w:r>
+        <w:rPr>
+          <w:rFonts w:ascii="华文楷体" w:eastAsia="华文楷体" w:hAnsi="华文楷体" w:hint="eastAsia"/>
+        </w:rPr>
+        <w:t>式提供</w:t>
+      </w:r>
+      <w:proofErr w:type="gramEnd"/>
+      <w:r>
+        <w:rPr>
+          <w:rFonts w:ascii="华文楷体" w:eastAsia="华文楷体" w:hAnsi="华文楷体" w:hint="eastAsia"/>
+        </w:rPr>
+        <w:t>密码，并随后提示用户修改</w:t>
       </w:r>
       <w:r>
         <w:rPr>
@@ -7637,7 +8290,35 @@
         <w:rPr>
           <w:rFonts w:ascii="华文楷体" w:eastAsia="华文楷体" w:hAnsi="华文楷体"/>
         </w:rPr>
-        <w:t>（2）大目录性能压力：当单个目录包含1000张以上图片时，缩略图加载和批量操作可能面临性能压力，软件的性能和稳定性需要重点关注和优化，确保用户在使用过程中不会遇到卡顿或崩溃等问题。</w:t>
+        <w:t>（2）大目录性能压力：当单个目录包含1000张以上图片时，</w:t>
+      </w:r>
+      <w:proofErr w:type="gramStart"/>
+      <w:r>
+        <w:rPr>
+          <w:rFonts w:ascii="华文楷体" w:eastAsia="华文楷体" w:hAnsi="华文楷体"/>
+        </w:rPr>
+        <w:t>缩略图加载</w:t>
+      </w:r>
+      <w:proofErr w:type="gramEnd"/>
+      <w:r>
+        <w:rPr>
+          <w:rFonts w:ascii="华文楷体" w:eastAsia="华文楷体" w:hAnsi="华文楷体"/>
+        </w:rPr>
+        <w:t>和批量操作可能面临性能压力，软件的性能和稳定性需要重点关注和优化，确保用户在使用过程中不会</w:t>
+      </w:r>
+      <w:proofErr w:type="gramStart"/>
+      <w:r>
+        <w:rPr>
+          <w:rFonts w:ascii="华文楷体" w:eastAsia="华文楷体" w:hAnsi="华文楷体"/>
+        </w:rPr>
+        <w:t>遇到卡顿</w:t>
+      </w:r>
+      <w:proofErr w:type="gramEnd"/>
+      <w:r>
+        <w:rPr>
+          <w:rFonts w:ascii="华文楷体" w:eastAsia="华文楷体" w:hAnsi="华文楷体"/>
+        </w:rPr>
+        <w:t>或崩溃等问题。</w:t>
       </w:r>
     </w:p>
     <w:p>
@@ -7677,7 +8358,63 @@
         <w:rPr>
           <w:rFonts w:ascii="华文楷体" w:eastAsia="华文楷体" w:hAnsi="华文楷体"/>
         </w:rPr>
-        <w:t>（4）事务失败回滚风险：批量重命名操作依赖数据库事务机制，若过程中发生文件占用或磁盘写入失败等问题，事务需正确回滚以保证数据一致性，开发中需充分测试各种异常场景。</w:t>
+        <w:t>（4）事务</w:t>
+      </w:r>
+      <w:proofErr w:type="gramStart"/>
+      <w:r>
+        <w:rPr>
+          <w:rFonts w:ascii="华文楷体" w:eastAsia="华文楷体" w:hAnsi="华文楷体"/>
+        </w:rPr>
+        <w:t>失败回滚</w:t>
+      </w:r>
+      <w:proofErr w:type="gramEnd"/>
+      <w:r>
+        <w:rPr>
+          <w:rFonts w:ascii="华文楷体" w:eastAsia="华文楷体" w:hAnsi="华文楷体"/>
+        </w:rPr>
+        <w:t>风险：批量重命名操作依赖数据库事务机制，</w:t>
+      </w:r>
+      <w:proofErr w:type="gramStart"/>
+      <w:r>
+        <w:rPr>
+          <w:rFonts w:ascii="华文楷体" w:eastAsia="华文楷体" w:hAnsi="华文楷体"/>
+        </w:rPr>
+        <w:t>若过程</w:t>
+      </w:r>
+      <w:proofErr w:type="gramEnd"/>
+      <w:r>
+        <w:rPr>
+          <w:rFonts w:ascii="华文楷体" w:eastAsia="华文楷体" w:hAnsi="华文楷体"/>
+        </w:rPr>
+        <w:t>中发生文件占用或磁盘写入失败等问题，事</w:t>
+      </w:r>
+      <w:proofErr w:type="gramStart"/>
+      <w:r>
+        <w:rPr>
+          <w:rFonts w:ascii="华文楷体" w:eastAsia="华文楷体" w:hAnsi="华文楷体"/>
+        </w:rPr>
+        <w:t>务需</w:t>
+      </w:r>
+      <w:proofErr w:type="gramEnd"/>
+      <w:r>
+        <w:rPr>
+          <w:rFonts w:ascii="华文楷体" w:eastAsia="华文楷体" w:hAnsi="华文楷体"/>
+        </w:rPr>
+        <w:t>正确</w:t>
+      </w:r>
+      <w:proofErr w:type="gramStart"/>
+      <w:r>
+        <w:rPr>
+          <w:rFonts w:ascii="华文楷体" w:eastAsia="华文楷体" w:hAnsi="华文楷体"/>
+        </w:rPr>
+        <w:t>回滚以</w:t>
+      </w:r>
+      <w:proofErr w:type="gramEnd"/>
+      <w:r>
+        <w:rPr>
+          <w:rFonts w:ascii="华文楷体" w:eastAsia="华文楷体" w:hAnsi="华文楷体"/>
+        </w:rPr>
+        <w:t>保证数据一致性，开发中需充分测试各种异常场景。</w:t>
       </w:r>
     </w:p>
     <w:p>
@@ -7816,8 +8553,18 @@
           <w:sz w:val="18"/>
           <w:szCs w:val="18"/>
         </w:rPr>
-        <w:t>绘制者：陈厚华</w:t>
-      </w:r>
+        <w:t>绘制者：</w:t>
+      </w:r>
+      <w:proofErr w:type="gramStart"/>
+      <w:r>
+        <w:rPr>
+          <w:rFonts w:ascii="华文楷体" w:eastAsia="华文楷体" w:hAnsi="华文楷体" w:hint="eastAsia"/>
+          <w:sz w:val="18"/>
+          <w:szCs w:val="18"/>
+        </w:rPr>
+        <w:t>陈厚华</w:t>
+      </w:r>
+      <w:proofErr w:type="gramEnd"/>
       <w:r>
         <w:rPr>
           <w:rFonts w:ascii="华文楷体" w:eastAsia="华文楷体" w:hAnsi="华文楷体" w:hint="eastAsia"/>
@@ -7855,7 +8602,7 @@
 </file>
 
 <file path=word/endnotes.xml><?xml version="1.0" encoding="utf-8"?>
-<w:endnotes xmlns:wpc="http://schemas.microsoft.com/office/word/2010/wordprocessingCanvas" xmlns:cx="http://schemas.microsoft.com/office/drawing/2014/chartex" xmlns:cx1="http://schemas.microsoft.com/office/drawing/2015/9/8/chartex" xmlns:cx2="http://schemas.microsoft.com/office/drawing/2015/10/21/chartex" xmlns:cx3="http://schemas.microsoft.com/office/drawing/2016/5/9/chartex" xmlns:cx4="http://schemas.microsoft.com/office/drawing/2016/5/10/chartex" xmlns:cx5="http://schemas.microsoft.com/office/drawing/2016/5/11/chartex" xmlns:cx6="http://schemas.microsoft.com/office/drawing/2016/5/12/chartex" xmlns:cx7="http://schemas.microsoft.com/office/drawing/2016/5/13/chartex" xmlns:cx8="http://schemas.microsoft.com/office/drawing/2016/5/14/chartex" xmlns:mc="http://schemas.openxmlformats.org/markup-compatibility/2006" xmlns:aink="http://schemas.microsoft.com/office/drawing/2016/ink" xmlns:am3d="http://schemas.microsoft.com/office/drawing/2017/model3d" xmlns:o="urn:schemas-microsoft-com:office:office" xmlns:oel="http://schemas.microsoft.com/office/2019/extlst" xmlns:r="http://schemas.openxmlformats.org/officeDocument/2006/relationships" xmlns:m="http://schemas.openxmlformats.org/officeDocument/2006/math" xmlns:v="urn:schemas-microsoft-com:vml" xmlns:wp14="http://schemas.microsoft.com/office/word/2010/wordprocessingDrawing" xmlns:wp="http://schemas.openxmlformats.org/drawingml/2006/wordprocessingDrawing" xmlns:w10="urn:schemas-microsoft-com:office:word" xmlns:w="http://schemas.openxmlformats.org/wordprocessingml/2006/main" xmlns:w14="http://schemas.microsoft.com/office/word/2010/wordml" xmlns:w15="http://schemas.microsoft.com/office/word/2012/wordml" xmlns:w16cex="http://schemas.microsoft.com/office/word/2018/wordml/cex" xmlns:w16cid="http://schemas.microsoft.com/office/word/2016/wordml/cid" xmlns:w16="http://schemas.microsoft.com/office/word/2018/wordml" xmlns:w16du="http://schemas.microsoft.com/office/word/2023/wordml/word16du" xmlns:w16sdtdh="http://schemas.microsoft.com/office/word/2020/wordml/sdtdatahash" xmlns:w16se="http://schemas.microsoft.com/office/word/2015/wordml/symex" xmlns:wpg="http://schemas.microsoft.com/office/word/2010/wordprocessingGroup" xmlns:wpi="http://schemas.microsoft.com/office/word/2010/wordprocessingInk" xmlns:wne="http://schemas.microsoft.com/office/word/2006/wordml" xmlns:wps="http://schemas.microsoft.com/office/word/2010/wordprocessingShape" mc:Ignorable="w14 w15 w16se w16cid w16 w16cex w16sdtdh w16du wp14">
+<w:endnotes xmlns:wpc="http://schemas.microsoft.com/office/word/2010/wordprocessingCanvas" xmlns:cx="http://schemas.microsoft.com/office/drawing/2014/chartex" xmlns:cx1="http://schemas.microsoft.com/office/drawing/2015/9/8/chartex" xmlns:cx2="http://schemas.microsoft.com/office/drawing/2015/10/21/chartex" xmlns:cx3="http://schemas.microsoft.com/office/drawing/2016/5/9/chartex" xmlns:cx4="http://schemas.microsoft.com/office/drawing/2016/5/10/chartex" xmlns:cx5="http://schemas.microsoft.com/office/drawing/2016/5/11/chartex" xmlns:cx6="http://schemas.microsoft.com/office/drawing/2016/5/12/chartex" xmlns:cx7="http://schemas.microsoft.com/office/drawing/2016/5/13/chartex" xmlns:cx8="http://schemas.microsoft.com/office/drawing/2016/5/14/chartex" xmlns:mc="http://schemas.openxmlformats.org/markup-compatibility/2006" xmlns:aink="http://schemas.microsoft.com/office/drawing/2016/ink" xmlns:am3d="http://schemas.microsoft.com/office/drawing/2017/model3d" xmlns:o="urn:schemas-microsoft-com:office:office" xmlns:oel="http://schemas.microsoft.com/office/2019/extlst" xmlns:r="http://schemas.openxmlformats.org/officeDocument/2006/relationships" xmlns:m="http://schemas.openxmlformats.org/officeDocument/2006/math" xmlns:v="urn:schemas-microsoft-com:vml" xmlns:wp14="http://schemas.microsoft.com/office/word/2010/wordprocessingDrawing" xmlns:wp="http://schemas.openxmlformats.org/drawingml/2006/wordprocessingDrawing" xmlns:w10="urn:schemas-microsoft-com:office:word" xmlns:w="http://schemas.openxmlformats.org/wordprocessingml/2006/main" xmlns:w14="http://schemas.microsoft.com/office/word/2010/wordml" xmlns:w15="http://schemas.microsoft.com/office/word/2012/wordml" xmlns:w16cex="http://schemas.microsoft.com/office/word/2018/wordml/cex" xmlns:w16cid="http://schemas.microsoft.com/office/word/2016/wordml/cid" xmlns:w16="http://schemas.microsoft.com/office/word/2018/wordml" xmlns:w16du="http://schemas.microsoft.com/office/word/2023/wordml/word16du" xmlns:w16sdtdh="http://schemas.microsoft.com/office/word/2020/wordml/sdtdatahash" xmlns:w16sdtfl="http://schemas.microsoft.com/office/word/2024/wordml/sdtformatlock" xmlns:w16se="http://schemas.microsoft.com/office/word/2015/wordml/symex" xmlns:wpg="http://schemas.microsoft.com/office/word/2010/wordprocessingGroup" xmlns:wpi="http://schemas.microsoft.com/office/word/2010/wordprocessingInk" xmlns:wne="http://schemas.microsoft.com/office/word/2006/wordml" xmlns:wps="http://schemas.microsoft.com/office/word/2010/wordprocessingShape" mc:Ignorable="w14 w15 w16se w16cid w16 w16cex w16sdtdh w16sdtfl w16du wp14">
   <w:endnote w:type="separator" w:id="-1">
     <w:p>
       <w:r>
@@ -7874,7 +8621,7 @@
 </file>
 
 <file path=word/footer1.xml><?xml version="1.0" encoding="utf-8"?>
-<w:ftr xmlns:wpc="http://schemas.microsoft.com/office/word/2010/wordprocessingCanvas" xmlns:cx="http://schemas.microsoft.com/office/drawing/2014/chartex" xmlns:cx1="http://schemas.microsoft.com/office/drawing/2015/9/8/chartex" xmlns:cx2="http://schemas.microsoft.com/office/drawing/2015/10/21/chartex" xmlns:cx3="http://schemas.microsoft.com/office/drawing/2016/5/9/chartex" xmlns:cx4="http://schemas.microsoft.com/office/drawing/2016/5/10/chartex" xmlns:cx5="http://schemas.microsoft.com/office/drawing/2016/5/11/chartex" xmlns:cx6="http://schemas.microsoft.com/office/drawing/2016/5/12/chartex" xmlns:cx7="http://schemas.microsoft.com/office/drawing/2016/5/13/chartex" xmlns:cx8="http://schemas.microsoft.com/office/drawing/2016/5/14/chartex" xmlns:mc="http://schemas.openxmlformats.org/markup-compatibility/2006" xmlns:aink="http://schemas.microsoft.com/office/drawing/2016/ink" xmlns:am3d="http://schemas.microsoft.com/office/drawing/2017/model3d" xmlns:o="urn:schemas-microsoft-com:office:office" xmlns:oel="http://schemas.microsoft.com/office/2019/extlst" xmlns:r="http://schemas.openxmlformats.org/officeDocument/2006/relationships" xmlns:m="http://schemas.openxmlformats.org/officeDocument/2006/math" xmlns:v="urn:schemas-microsoft-com:vml" xmlns:wp14="http://schemas.microsoft.com/office/word/2010/wordprocessingDrawing" xmlns:wp="http://schemas.openxmlformats.org/drawingml/2006/wordprocessingDrawing" xmlns:w10="urn:schemas-microsoft-com:office:word" xmlns:w="http://schemas.openxmlformats.org/wordprocessingml/2006/main" xmlns:w14="http://schemas.microsoft.com/office/word/2010/wordml" xmlns:w15="http://schemas.microsoft.com/office/word/2012/wordml" xmlns:w16cex="http://schemas.microsoft.com/office/word/2018/wordml/cex" xmlns:w16cid="http://schemas.microsoft.com/office/word/2016/wordml/cid" xmlns:w16="http://schemas.microsoft.com/office/word/2018/wordml" xmlns:w16du="http://schemas.microsoft.com/office/word/2023/wordml/word16du" xmlns:w16sdtdh="http://schemas.microsoft.com/office/word/2020/wordml/sdtdatahash" xmlns:w16se="http://schemas.microsoft.com/office/word/2015/wordml/symex" xmlns:wpg="http://schemas.microsoft.com/office/word/2010/wordprocessingGroup" xmlns:wpi="http://schemas.microsoft.com/office/word/2010/wordprocessingInk" xmlns:wne="http://schemas.microsoft.com/office/word/2006/wordml" xmlns:wps="http://schemas.microsoft.com/office/word/2010/wordprocessingShape" mc:Ignorable="w14 w15 w16se w16cid w16 w16cex w16sdtdh w16du wp14">
+<w:ftr xmlns:wpc="http://schemas.microsoft.com/office/word/2010/wordprocessingCanvas" xmlns:cx="http://schemas.microsoft.com/office/drawing/2014/chartex" xmlns:cx1="http://schemas.microsoft.com/office/drawing/2015/9/8/chartex" xmlns:cx2="http://schemas.microsoft.com/office/drawing/2015/10/21/chartex" xmlns:cx3="http://schemas.microsoft.com/office/drawing/2016/5/9/chartex" xmlns:cx4="http://schemas.microsoft.com/office/drawing/2016/5/10/chartex" xmlns:cx5="http://schemas.microsoft.com/office/drawing/2016/5/11/chartex" xmlns:cx6="http://schemas.microsoft.com/office/drawing/2016/5/12/chartex" xmlns:cx7="http://schemas.microsoft.com/office/drawing/2016/5/13/chartex" xmlns:cx8="http://schemas.microsoft.com/office/drawing/2016/5/14/chartex" xmlns:mc="http://schemas.openxmlformats.org/markup-compatibility/2006" xmlns:aink="http://schemas.microsoft.com/office/drawing/2016/ink" xmlns:am3d="http://schemas.microsoft.com/office/drawing/2017/model3d" xmlns:o="urn:schemas-microsoft-com:office:office" xmlns:oel="http://schemas.microsoft.com/office/2019/extlst" xmlns:r="http://schemas.openxmlformats.org/officeDocument/2006/relationships" xmlns:m="http://schemas.openxmlformats.org/officeDocument/2006/math" xmlns:v="urn:schemas-microsoft-com:vml" xmlns:wp14="http://schemas.microsoft.com/office/word/2010/wordprocessingDrawing" xmlns:wp="http://schemas.openxmlformats.org/drawingml/2006/wordprocessingDrawing" xmlns:w10="urn:schemas-microsoft-com:office:word" xmlns:w="http://schemas.openxmlformats.org/wordprocessingml/2006/main" xmlns:w14="http://schemas.microsoft.com/office/word/2010/wordml" xmlns:w15="http://schemas.microsoft.com/office/word/2012/wordml" xmlns:w16cex="http://schemas.microsoft.com/office/word/2018/wordml/cex" xmlns:w16cid="http://schemas.microsoft.com/office/word/2016/wordml/cid" xmlns:w16="http://schemas.microsoft.com/office/word/2018/wordml" xmlns:w16du="http://schemas.microsoft.com/office/word/2023/wordml/word16du" xmlns:w16sdtdh="http://schemas.microsoft.com/office/word/2020/wordml/sdtdatahash" xmlns:w16sdtfl="http://schemas.microsoft.com/office/word/2024/wordml/sdtformatlock" xmlns:w16se="http://schemas.microsoft.com/office/word/2015/wordml/symex" xmlns:wpg="http://schemas.microsoft.com/office/word/2010/wordprocessingGroup" xmlns:wpi="http://schemas.microsoft.com/office/word/2010/wordprocessingInk" xmlns:wne="http://schemas.microsoft.com/office/word/2006/wordml" xmlns:wps="http://schemas.microsoft.com/office/word/2010/wordprocessingShape" mc:Ignorable="w14 w15 w16se w16cid w16 w16cex w16sdtdh w16sdtfl w16du wp14">
   <w:p>
     <w:pPr>
       <w:pStyle w:val="a7"/>
@@ -8021,7 +8768,7 @@
 </file>
 
 <file path=word/footnotes.xml><?xml version="1.0" encoding="utf-8"?>
-<w:footnotes xmlns:wpc="http://schemas.microsoft.com/office/word/2010/wordprocessingCanvas" xmlns:cx="http://schemas.microsoft.com/office/drawing/2014/chartex" xmlns:cx1="http://schemas.microsoft.com/office/drawing/2015/9/8/chartex" xmlns:cx2="http://schemas.microsoft.com/office/drawing/2015/10/21/chartex" xmlns:cx3="http://schemas.microsoft.com/office/drawing/2016/5/9/chartex" xmlns:cx4="http://schemas.microsoft.com/office/drawing/2016/5/10/chartex" xmlns:cx5="http://schemas.microsoft.com/office/drawing/2016/5/11/chartex" xmlns:cx6="http://schemas.microsoft.com/office/drawing/2016/5/12/chartex" xmlns:cx7="http://schemas.microsoft.com/office/drawing/2016/5/13/chartex" xmlns:cx8="http://schemas.microsoft.com/office/drawing/2016/5/14/chartex" xmlns:mc="http://schemas.openxmlformats.org/markup-compatibility/2006" xmlns:aink="http://schemas.microsoft.com/office/drawing/2016/ink" xmlns:am3d="http://schemas.microsoft.com/office/drawing/2017/model3d" xmlns:o="urn:schemas-microsoft-com:office:office" xmlns:oel="http://schemas.microsoft.com/office/2019/extlst" xmlns:r="http://schemas.openxmlformats.org/officeDocument/2006/relationships" xmlns:m="http://schemas.openxmlformats.org/officeDocument/2006/math" xmlns:v="urn:schemas-microsoft-com:vml" xmlns:wp14="http://schemas.microsoft.com/office/word/2010/wordprocessingDrawing" xmlns:wp="http://schemas.openxmlformats.org/drawingml/2006/wordprocessingDrawing" xmlns:w10="urn:schemas-microsoft-com:office:word" xmlns:w="http://schemas.openxmlformats.org/wordprocessingml/2006/main" xmlns:w14="http://schemas.microsoft.com/office/word/2010/wordml" xmlns:w15="http://schemas.microsoft.com/office/word/2012/wordml" xmlns:w16cex="http://schemas.microsoft.com/office/word/2018/wordml/cex" xmlns:w16cid="http://schemas.microsoft.com/office/word/2016/wordml/cid" xmlns:w16="http://schemas.microsoft.com/office/word/2018/wordml" xmlns:w16du="http://schemas.microsoft.com/office/word/2023/wordml/word16du" xmlns:w16sdtdh="http://schemas.microsoft.com/office/word/2020/wordml/sdtdatahash" xmlns:w16se="http://schemas.microsoft.com/office/word/2015/wordml/symex" xmlns:wpg="http://schemas.microsoft.com/office/word/2010/wordprocessingGroup" xmlns:wpi="http://schemas.microsoft.com/office/word/2010/wordprocessingInk" xmlns:wne="http://schemas.microsoft.com/office/word/2006/wordml" xmlns:wps="http://schemas.microsoft.com/office/word/2010/wordprocessingShape" mc:Ignorable="w14 w15 w16se w16cid w16 w16cex w16sdtdh w16du wp14">
+<w:footnotes xmlns:wpc="http://schemas.microsoft.com/office/word/2010/wordprocessingCanvas" xmlns:cx="http://schemas.microsoft.com/office/drawing/2014/chartex" xmlns:cx1="http://schemas.microsoft.com/office/drawing/2015/9/8/chartex" xmlns:cx2="http://schemas.microsoft.com/office/drawing/2015/10/21/chartex" xmlns:cx3="http://schemas.microsoft.com/office/drawing/2016/5/9/chartex" xmlns:cx4="http://schemas.microsoft.com/office/drawing/2016/5/10/chartex" xmlns:cx5="http://schemas.microsoft.com/office/drawing/2016/5/11/chartex" xmlns:cx6="http://schemas.microsoft.com/office/drawing/2016/5/12/chartex" xmlns:cx7="http://schemas.microsoft.com/office/drawing/2016/5/13/chartex" xmlns:cx8="http://schemas.microsoft.com/office/drawing/2016/5/14/chartex" xmlns:mc="http://schemas.openxmlformats.org/markup-compatibility/2006" xmlns:aink="http://schemas.microsoft.com/office/drawing/2016/ink" xmlns:am3d="http://schemas.microsoft.com/office/drawing/2017/model3d" xmlns:o="urn:schemas-microsoft-com:office:office" xmlns:oel="http://schemas.microsoft.com/office/2019/extlst" xmlns:r="http://schemas.openxmlformats.org/officeDocument/2006/relationships" xmlns:m="http://schemas.openxmlformats.org/officeDocument/2006/math" xmlns:v="urn:schemas-microsoft-com:vml" xmlns:wp14="http://schemas.microsoft.com/office/word/2010/wordprocessingDrawing" xmlns:wp="http://schemas.openxmlformats.org/drawingml/2006/wordprocessingDrawing" xmlns:w10="urn:schemas-microsoft-com:office:word" xmlns:w="http://schemas.openxmlformats.org/wordprocessingml/2006/main" xmlns:w14="http://schemas.microsoft.com/office/word/2010/wordml" xmlns:w15="http://schemas.microsoft.com/office/word/2012/wordml" xmlns:w16cex="http://schemas.microsoft.com/office/word/2018/wordml/cex" xmlns:w16cid="http://schemas.microsoft.com/office/word/2016/wordml/cid" xmlns:w16="http://schemas.microsoft.com/office/word/2018/wordml" xmlns:w16du="http://schemas.microsoft.com/office/word/2023/wordml/word16du" xmlns:w16sdtdh="http://schemas.microsoft.com/office/word/2020/wordml/sdtdatahash" xmlns:w16sdtfl="http://schemas.microsoft.com/office/word/2024/wordml/sdtformatlock" xmlns:w16se="http://schemas.microsoft.com/office/word/2015/wordml/symex" xmlns:wpg="http://schemas.microsoft.com/office/word/2010/wordprocessingGroup" xmlns:wpi="http://schemas.microsoft.com/office/word/2010/wordprocessingInk" xmlns:wne="http://schemas.microsoft.com/office/word/2006/wordml" xmlns:wps="http://schemas.microsoft.com/office/word/2010/wordprocessingShape" mc:Ignorable="w14 w15 w16se w16cid w16 w16cex w16sdtdh w16sdtfl w16du wp14">
   <w:footnote w:type="separator" w:id="-1">
     <w:p>
       <w:r>
@@ -8040,7 +8787,7 @@
 </file>
 
 <file path=word/numbering.xml><?xml version="1.0" encoding="utf-8"?>
-<w:numbering xmlns:wpc="http://schemas.microsoft.com/office/word/2010/wordprocessingCanvas" xmlns:cx="http://schemas.microsoft.com/office/drawing/2014/chartex" xmlns:cx1="http://schemas.microsoft.com/office/drawing/2015/9/8/chartex" xmlns:cx2="http://schemas.microsoft.com/office/drawing/2015/10/21/chartex" xmlns:cx3="http://schemas.microsoft.com/office/drawing/2016/5/9/chartex" xmlns:cx4="http://schemas.microsoft.com/office/drawing/2016/5/10/chartex" xmlns:cx5="http://schemas.microsoft.com/office/drawing/2016/5/11/chartex" xmlns:cx6="http://schemas.microsoft.com/office/drawing/2016/5/12/chartex" xmlns:cx7="http://schemas.microsoft.com/office/drawing/2016/5/13/chartex" xmlns:cx8="http://schemas.microsoft.com/office/drawing/2016/5/14/chartex" xmlns:mc="http://schemas.openxmlformats.org/markup-compatibility/2006" xmlns:aink="http://schemas.microsoft.com/office/drawing/2016/ink" xmlns:am3d="http://schemas.microsoft.com/office/drawing/2017/model3d" xmlns:o="urn:schemas-microsoft-com:office:office" xmlns:oel="http://schemas.microsoft.com/office/2019/extlst" xmlns:r="http://schemas.openxmlformats.org/officeDocument/2006/relationships" xmlns:m="http://schemas.openxmlformats.org/officeDocument/2006/math" xmlns:v="urn:schemas-microsoft-com:vml" xmlns:wp14="http://schemas.microsoft.com/office/word/2010/wordprocessingDrawing" xmlns:wp="http://schemas.openxmlformats.org/drawingml/2006/wordprocessingDrawing" xmlns:w10="urn:schemas-microsoft-com:office:word" xmlns:w="http://schemas.openxmlformats.org/wordprocessingml/2006/main" xmlns:w14="http://schemas.microsoft.com/office/word/2010/wordml" xmlns:w15="http://schemas.microsoft.com/office/word/2012/wordml" xmlns:w16cex="http://schemas.microsoft.com/office/word/2018/wordml/cex" xmlns:w16cid="http://schemas.microsoft.com/office/word/2016/wordml/cid" xmlns:w16="http://schemas.microsoft.com/office/word/2018/wordml" xmlns:w16du="http://schemas.microsoft.com/office/word/2023/wordml/word16du" xmlns:w16sdtdh="http://schemas.microsoft.com/office/word/2020/wordml/sdtdatahash" xmlns:w16se="http://schemas.microsoft.com/office/word/2015/wordml/symex" xmlns:wpg="http://schemas.microsoft.com/office/word/2010/wordprocessingGroup" xmlns:wpi="http://schemas.microsoft.com/office/word/2010/wordprocessingInk" xmlns:wne="http://schemas.microsoft.com/office/word/2006/wordml" xmlns:wps="http://schemas.microsoft.com/office/word/2010/wordprocessingShape" mc:Ignorable="w14 w15 w16se w16cid w16 w16cex w16sdtdh w16du wp14">
+<w:numbering xmlns:wpc="http://schemas.microsoft.com/office/word/2010/wordprocessingCanvas" xmlns:cx="http://schemas.microsoft.com/office/drawing/2014/chartex" xmlns:cx1="http://schemas.microsoft.com/office/drawing/2015/9/8/chartex" xmlns:cx2="http://schemas.microsoft.com/office/drawing/2015/10/21/chartex" xmlns:cx3="http://schemas.microsoft.com/office/drawing/2016/5/9/chartex" xmlns:cx4="http://schemas.microsoft.com/office/drawing/2016/5/10/chartex" xmlns:cx5="http://schemas.microsoft.com/office/drawing/2016/5/11/chartex" xmlns:cx6="http://schemas.microsoft.com/office/drawing/2016/5/12/chartex" xmlns:cx7="http://schemas.microsoft.com/office/drawing/2016/5/13/chartex" xmlns:cx8="http://schemas.microsoft.com/office/drawing/2016/5/14/chartex" xmlns:mc="http://schemas.openxmlformats.org/markup-compatibility/2006" xmlns:aink="http://schemas.microsoft.com/office/drawing/2016/ink" xmlns:am3d="http://schemas.microsoft.com/office/drawing/2017/model3d" xmlns:o="urn:schemas-microsoft-com:office:office" xmlns:oel="http://schemas.microsoft.com/office/2019/extlst" xmlns:r="http://schemas.openxmlformats.org/officeDocument/2006/relationships" xmlns:m="http://schemas.openxmlformats.org/officeDocument/2006/math" xmlns:v="urn:schemas-microsoft-com:vml" xmlns:wp14="http://schemas.microsoft.com/office/word/2010/wordprocessingDrawing" xmlns:wp="http://schemas.openxmlformats.org/drawingml/2006/wordprocessingDrawing" xmlns:w10="urn:schemas-microsoft-com:office:word" xmlns:w="http://schemas.openxmlformats.org/wordprocessingml/2006/main" xmlns:w14="http://schemas.microsoft.com/office/word/2010/wordml" xmlns:w15="http://schemas.microsoft.com/office/word/2012/wordml" xmlns:w16cex="http://schemas.microsoft.com/office/word/2018/wordml/cex" xmlns:w16cid="http://schemas.microsoft.com/office/word/2016/wordml/cid" xmlns:w16="http://schemas.microsoft.com/office/word/2018/wordml" xmlns:w16du="http://schemas.microsoft.com/office/word/2023/wordml/word16du" xmlns:w16sdtdh="http://schemas.microsoft.com/office/word/2020/wordml/sdtdatahash" xmlns:w16sdtfl="http://schemas.microsoft.com/office/word/2024/wordml/sdtformatlock" xmlns:w16se="http://schemas.microsoft.com/office/word/2015/wordml/symex" xmlns:wpg="http://schemas.microsoft.com/office/word/2010/wordprocessingGroup" xmlns:wpi="http://schemas.microsoft.com/office/word/2010/wordprocessingInk" xmlns:wne="http://schemas.microsoft.com/office/word/2006/wordml" xmlns:wps="http://schemas.microsoft.com/office/word/2010/wordprocessingShape" mc:Ignorable="w14 w15 w16se w16cid w16 w16cex w16sdtdh w16sdtfl w16du wp14">
   <w:abstractNum w:abstractNumId="0" w15:restartNumberingAfterBreak="0">
     <w:nsid w:val="58B616BC"/>
     <w:multiLevelType w:val="singleLevel"/>
@@ -8083,7 +8830,7 @@
 </file>
 
 <file path=word/styles.xml><?xml version="1.0" encoding="utf-8"?>
-<w:styles xmlns:mc="http://schemas.openxmlformats.org/markup-compatibility/2006" xmlns:r="http://schemas.openxmlformats.org/officeDocument/2006/relationships" xmlns:w="http://schemas.openxmlformats.org/wordprocessingml/2006/main" xmlns:w14="http://schemas.microsoft.com/office/word/2010/wordml" xmlns:w15="http://schemas.microsoft.com/office/word/2012/wordml" xmlns:w16cex="http://schemas.microsoft.com/office/word/2018/wordml/cex" xmlns:w16cid="http://schemas.microsoft.com/office/word/2016/wordml/cid" xmlns:w16="http://schemas.microsoft.com/office/word/2018/wordml" xmlns:w16du="http://schemas.microsoft.com/office/word/2023/wordml/word16du" xmlns:w16sdtdh="http://schemas.microsoft.com/office/word/2020/wordml/sdtdatahash" xmlns:w16se="http://schemas.microsoft.com/office/word/2015/wordml/symex" mc:Ignorable="w14 w15 w16se w16cid w16 w16cex w16sdtdh w16du">
+<w:styles xmlns:mc="http://schemas.openxmlformats.org/markup-compatibility/2006" xmlns:r="http://schemas.openxmlformats.org/officeDocument/2006/relationships" xmlns:w="http://schemas.openxmlformats.org/wordprocessingml/2006/main" xmlns:w14="http://schemas.microsoft.com/office/word/2010/wordml" xmlns:w15="http://schemas.microsoft.com/office/word/2012/wordml" xmlns:w16cex="http://schemas.microsoft.com/office/word/2018/wordml/cex" xmlns:w16cid="http://schemas.microsoft.com/office/word/2016/wordml/cid" xmlns:w16="http://schemas.microsoft.com/office/word/2018/wordml" xmlns:w16du="http://schemas.microsoft.com/office/word/2023/wordml/word16du" xmlns:w16sdtdh="http://schemas.microsoft.com/office/word/2020/wordml/sdtdatahash" xmlns:w16sdtfl="http://schemas.microsoft.com/office/word/2024/wordml/sdtformatlock" xmlns:w16se="http://schemas.microsoft.com/office/word/2015/wordml/symex" mc:Ignorable="w14 w15 w16se w16cid w16 w16cex w16sdtdh w16sdtfl w16du">
   <w:docDefaults>
     <w:rPrDefault>
       <w:rPr>

</xml_diff>